<commit_message>
data: refresh SysML AI catalog
</commit_message>
<xml_diff>
--- a/public/reports/sysml-ai-research-report.docx
+++ b/public/reports/sysml-ai-research-report.docx
@@ -88,7 +88,7 @@
                 <w:color w:val="0B2545"/>
                 <w:sz w:val="22"/>
               </w:rPr>
-              <w:t>2026-07-29</w:t>
+              <w:t>2026-07-30</w:t>
             </w:r>
           </w:p>
         </w:tc>
@@ -122,7 +122,7 @@
                 <w:color w:val="0B2545"/>
                 <w:sz w:val="22"/>
               </w:rPr>
-              <w:t>2026-08-01</w:t>
+              <w:t>2026-08-02</w:t>
             </w:r>
           </w:p>
         </w:tc>
@@ -158,7 +158,7 @@
                 <w:color w:val="0B2545"/>
                 <w:sz w:val="22"/>
               </w:rPr>
-              <w:t>15 个</w:t>
+              <w:t>16 个</w:t>
             </w:r>
           </w:p>
         </w:tc>
@@ -220,7 +220,7 @@
           <w:rFonts w:ascii="Microsoft YaHei" w:hAnsi="Microsoft YaHei" w:eastAsia="Microsoft YaHei"/>
           <w:color w:val="0B2545"/>
         </w:rPr>
-        <w:t xml:space="preserve"> 当前共收录 15 个项目，其中 5 个已验证、12 个确认为开源。 调研重点是这些工具在系统建模生命周期中的实际用途，而不只是在何种 AI 客户端中运行。</w:t>
+        <w:t xml:space="preserve"> 当前共收录 16 个项目，其中 5 个已验证、13 个确认为开源。 调研重点是这些工具在系统建模生命周期中的实际用途，而不只是在何种 AI 客户端中运行。</w:t>
       </w:r>
     </w:p>
     <w:p>
@@ -235,7 +235,7 @@
           <w:color w:val="0B2545"/>
           <w:sz w:val="22"/>
         </w:rPr>
-        <w:t>标准覆盖：SysML v2（7）；KerML（3）；通用 MBSE（1）；SysML (version unspecified)（2）；SysML v1（5）；UML（1）</w:t>
+        <w:t>标准覆盖：SysML v2（8）；KerML（3）；通用 MBSE（1）；SysML (version unspecified)（2）；SysML v1（5）；UML（1）</w:t>
       </w:r>
     </w:p>
     <w:p>
@@ -708,7 +708,7 @@
                 <w:color w:val="0B2545"/>
                 <w:sz w:val="17"/>
               </w:rPr>
-              <w:t>@engineer-fumi/sysml-v2-mcp、SysMLV2-MCP、cameo-mcp-bridge、jgs-magic-sysmlv1-mcp、jgs-magic-sysmlv1-pro、SysML v2 MCP Server by Raghunath Torase</w:t>
+              <w:t>@engineer-fumi/sysml-v2-mcp、SysMLV2-MCP、cameo-mcp-bridge、jgs-magic-sysmlv1-mcp、jgs-magic-sysmlv1-pro、mcp-syson、SysML v2 MCP Server by Raghunath Torase</w:t>
             </w:r>
           </w:p>
         </w:tc>
@@ -5338,7 +5338,380 @@
         <w:pageBreakBefore/>
       </w:pPr>
       <w:r>
-        <w:t>3.13 SysML v2 MCP Server by Raghunath Torase</w:t>
+        <w:t>3.13 mcp-syson</w:t>
+      </w:r>
+    </w:p>
+    <w:p>
+      <w:pPr>
+        <w:spacing w:after="160"/>
+      </w:pPr>
+      <w:r>
+        <w:rPr>
+          <w:rFonts w:ascii="Microsoft YaHei" w:hAnsi="Microsoft YaHei" w:eastAsia="Microsoft YaHei"/>
+          <w:b/>
+          <w:color w:val="007079"/>
+          <w:sz w:val="18"/>
+        </w:rPr>
+        <w:t>MCP Server · SysML v2 · 待验证 · 开源</w:t>
+      </w:r>
+    </w:p>
+    <w:tbl>
+      <w:tblPr>
+        <w:tblStyle w:val="TableGrid"/>
+        <w:tblW w:type="dxa" w:w="9360"/>
+        <w:jc w:val="left"/>
+        <w:tblLayout w:type="fixed"/>
+        <w:tblLook w:firstColumn="1" w:firstRow="1" w:lastColumn="0" w:lastRow="0" w:noHBand="0" w:noVBand="1" w:val="04A0"/>
+        <w:tblInd w:w="120" w:type="dxa"/>
+      </w:tblPr>
+      <w:tblGrid>
+        <w:gridCol w:w="1700"/>
+        <w:gridCol w:w="7660"/>
+      </w:tblGrid>
+      <w:tr>
+        <w:tc>
+          <w:tcPr>
+            <w:tcW w:type="dxa" w:w="1700"/>
+            <w:shd w:fill="E8EEF5"/>
+            <w:vAlign w:val="top"/>
+            <w:tcMar>
+              <w:top w:w="80" w:type="dxa"/>
+              <w:start w:w="120" w:type="dxa"/>
+              <w:bottom w:w="80" w:type="dxa"/>
+              <w:end w:w="120" w:type="dxa"/>
+            </w:tcMar>
+          </w:tcPr>
+          <w:p>
+            <w:r>
+              <w:rPr>
+                <w:rFonts w:ascii="Microsoft YaHei" w:hAnsi="Microsoft YaHei" w:eastAsia="Microsoft YaHei"/>
+                <w:b/>
+                <w:color w:val="0B2545"/>
+                <w:sz w:val="18"/>
+              </w:rPr>
+              <w:t>功能说明</w:t>
+            </w:r>
+          </w:p>
+        </w:tc>
+        <w:tc>
+          <w:tcPr>
+            <w:tcW w:type="dxa" w:w="7660"/>
+            <w:vAlign w:val="top"/>
+            <w:tcMar>
+              <w:top w:w="80" w:type="dxa"/>
+              <w:start w:w="120" w:type="dxa"/>
+              <w:bottom w:w="80" w:type="dxa"/>
+              <w:end w:w="120" w:type="dxa"/>
+            </w:tcMar>
+          </w:tcPr>
+          <w:p>
+            <w:r>
+              <w:rPr>
+                <w:rFonts w:ascii="Microsoft YaHei" w:hAnsi="Microsoft YaHei" w:eastAsia="Microsoft YaHei"/>
+                <w:color w:val="0B2545"/>
+                <w:sz w:val="18"/>
+              </w:rPr>
+              <w:t>公开描述：MCP server for SysON — SysML v2 MBSE modelling, AQL queries and requirements tracing for AI agents. 29 tools, 4 interactive UI viewers, docker-compose included。该功能说明由规则提取，需在下一次人工复核时确认。</w:t>
+            </w:r>
+          </w:p>
+        </w:tc>
+      </w:tr>
+      <w:tr>
+        <w:tc>
+          <w:tcPr>
+            <w:tcW w:type="dxa" w:w="1700"/>
+            <w:shd w:fill="E8EEF5"/>
+            <w:vAlign w:val="top"/>
+            <w:tcMar>
+              <w:top w:w="80" w:type="dxa"/>
+              <w:start w:w="120" w:type="dxa"/>
+              <w:bottom w:w="80" w:type="dxa"/>
+              <w:end w:w="120" w:type="dxa"/>
+            </w:tcMar>
+          </w:tcPr>
+          <w:p>
+            <w:r>
+              <w:rPr>
+                <w:rFonts w:ascii="Microsoft YaHei" w:hAnsi="Microsoft YaHei" w:eastAsia="Microsoft YaHei"/>
+                <w:b/>
+                <w:color w:val="0B2545"/>
+                <w:sz w:val="18"/>
+              </w:rPr>
+              <w:t>适用场景</w:t>
+            </w:r>
+          </w:p>
+        </w:tc>
+        <w:tc>
+          <w:tcPr>
+            <w:tcW w:type="dxa" w:w="7660"/>
+            <w:vAlign w:val="top"/>
+            <w:tcMar>
+              <w:top w:w="80" w:type="dxa"/>
+              <w:start w:w="120" w:type="dxa"/>
+              <w:bottom w:w="80" w:type="dxa"/>
+              <w:end w:w="120" w:type="dxa"/>
+            </w:tcMar>
+          </w:tcPr>
+          <w:p>
+            <w:r>
+              <w:rPr>
+                <w:rFonts w:ascii="Microsoft YaHei" w:hAnsi="Microsoft YaHei" w:eastAsia="Microsoft YaHei"/>
+                <w:color w:val="0B2545"/>
+                <w:sz w:val="18"/>
+              </w:rPr>
+              <w:t>需求建模</w:t>
+            </w:r>
+          </w:p>
+        </w:tc>
+      </w:tr>
+      <w:tr>
+        <w:tc>
+          <w:tcPr>
+            <w:tcW w:type="dxa" w:w="1700"/>
+            <w:shd w:fill="E8EEF5"/>
+            <w:vAlign w:val="top"/>
+            <w:tcMar>
+              <w:top w:w="80" w:type="dxa"/>
+              <w:start w:w="120" w:type="dxa"/>
+              <w:bottom w:w="80" w:type="dxa"/>
+              <w:end w:w="120" w:type="dxa"/>
+            </w:tcMar>
+          </w:tcPr>
+          <w:p>
+            <w:r>
+              <w:rPr>
+                <w:rFonts w:ascii="Microsoft YaHei" w:hAnsi="Microsoft YaHei" w:eastAsia="Microsoft YaHei"/>
+                <w:b/>
+                <w:color w:val="0B2545"/>
+                <w:sz w:val="18"/>
+              </w:rPr>
+              <w:t>核心能力</w:t>
+            </w:r>
+          </w:p>
+        </w:tc>
+        <w:tc>
+          <w:tcPr>
+            <w:tcW w:type="dxa" w:w="7660"/>
+            <w:vAlign w:val="top"/>
+            <w:tcMar>
+              <w:top w:w="80" w:type="dxa"/>
+              <w:start w:w="120" w:type="dxa"/>
+              <w:bottom w:w="80" w:type="dxa"/>
+              <w:end w:w="120" w:type="dxa"/>
+            </w:tcMar>
+          </w:tcPr>
+          <w:p>
+            <w:r>
+              <w:rPr>
+                <w:rFonts w:ascii="Microsoft YaHei" w:hAnsi="Microsoft YaHei" w:eastAsia="Microsoft YaHei"/>
+                <w:color w:val="0B2545"/>
+                <w:sz w:val="18"/>
+              </w:rPr>
+              <w:t>待进一步分析</w:t>
+            </w:r>
+          </w:p>
+        </w:tc>
+      </w:tr>
+      <w:tr>
+        <w:tc>
+          <w:tcPr>
+            <w:tcW w:type="dxa" w:w="1700"/>
+            <w:shd w:fill="E8EEF5"/>
+            <w:vAlign w:val="top"/>
+            <w:tcMar>
+              <w:top w:w="80" w:type="dxa"/>
+              <w:start w:w="120" w:type="dxa"/>
+              <w:bottom w:w="80" w:type="dxa"/>
+              <w:end w:w="120" w:type="dxa"/>
+            </w:tcMar>
+          </w:tcPr>
+          <w:p>
+            <w:r>
+              <w:rPr>
+                <w:rFonts w:ascii="Microsoft YaHei" w:hAnsi="Microsoft YaHei" w:eastAsia="Microsoft YaHei"/>
+                <w:b/>
+                <w:color w:val="0B2545"/>
+                <w:sz w:val="18"/>
+              </w:rPr>
+              <w:t>支持平台</w:t>
+            </w:r>
+          </w:p>
+        </w:tc>
+        <w:tc>
+          <w:tcPr>
+            <w:tcW w:type="dxa" w:w="7660"/>
+            <w:vAlign w:val="top"/>
+            <w:tcMar>
+              <w:top w:w="80" w:type="dxa"/>
+              <w:start w:w="120" w:type="dxa"/>
+              <w:bottom w:w="80" w:type="dxa"/>
+              <w:end w:w="120" w:type="dxa"/>
+            </w:tcMar>
+          </w:tcPr>
+          <w:p>
+            <w:r>
+              <w:rPr>
+                <w:rFonts w:ascii="Microsoft YaHei" w:hAnsi="Microsoft YaHei" w:eastAsia="Microsoft YaHei"/>
+                <w:color w:val="0B2545"/>
+                <w:sz w:val="18"/>
+              </w:rPr>
+              <w:t>MCP</w:t>
+            </w:r>
+          </w:p>
+        </w:tc>
+      </w:tr>
+      <w:tr>
+        <w:tc>
+          <w:tcPr>
+            <w:tcW w:type="dxa" w:w="1700"/>
+            <w:shd w:fill="E8EEF5"/>
+            <w:vAlign w:val="top"/>
+            <w:tcMar>
+              <w:top w:w="80" w:type="dxa"/>
+              <w:start w:w="120" w:type="dxa"/>
+              <w:bottom w:w="80" w:type="dxa"/>
+              <w:end w:w="120" w:type="dxa"/>
+            </w:tcMar>
+          </w:tcPr>
+          <w:p>
+            <w:r>
+              <w:rPr>
+                <w:rFonts w:ascii="Microsoft YaHei" w:hAnsi="Microsoft YaHei" w:eastAsia="Microsoft YaHei"/>
+                <w:b/>
+                <w:color w:val="0B2545"/>
+                <w:sz w:val="18"/>
+              </w:rPr>
+              <w:t>隐私与离线</w:t>
+            </w:r>
+          </w:p>
+        </w:tc>
+        <w:tc>
+          <w:tcPr>
+            <w:tcW w:type="dxa" w:w="7660"/>
+            <w:vAlign w:val="top"/>
+            <w:tcMar>
+              <w:top w:w="80" w:type="dxa"/>
+              <w:start w:w="120" w:type="dxa"/>
+              <w:bottom w:w="80" w:type="dxa"/>
+              <w:end w:w="120" w:type="dxa"/>
+            </w:tcMar>
+          </w:tcPr>
+          <w:p>
+            <w:r>
+              <w:rPr>
+                <w:rFonts w:ascii="Microsoft YaHei" w:hAnsi="Microsoft YaHei" w:eastAsia="Microsoft YaHei"/>
+                <w:color w:val="0B2545"/>
+                <w:sz w:val="18"/>
+              </w:rPr>
+              <w:t>自动发现项目，数据隐私与离线能力尚待核验。（离线能力：unknown）</w:t>
+            </w:r>
+          </w:p>
+        </w:tc>
+      </w:tr>
+      <w:tr>
+        <w:tc>
+          <w:tcPr>
+            <w:tcW w:type="dxa" w:w="1700"/>
+            <w:shd w:fill="E8EEF5"/>
+            <w:vAlign w:val="top"/>
+            <w:tcMar>
+              <w:top w:w="80" w:type="dxa"/>
+              <w:start w:w="120" w:type="dxa"/>
+              <w:bottom w:w="80" w:type="dxa"/>
+              <w:end w:w="120" w:type="dxa"/>
+            </w:tcMar>
+          </w:tcPr>
+          <w:p>
+            <w:r>
+              <w:rPr>
+                <w:rFonts w:ascii="Microsoft YaHei" w:hAnsi="Microsoft YaHei" w:eastAsia="Microsoft YaHei"/>
+                <w:b/>
+                <w:color w:val="0B2545"/>
+                <w:sz w:val="18"/>
+              </w:rPr>
+              <w:t>项目地址</w:t>
+            </w:r>
+          </w:p>
+        </w:tc>
+        <w:tc>
+          <w:tcPr>
+            <w:tcW w:type="dxa" w:w="7660"/>
+            <w:vAlign w:val="top"/>
+            <w:tcMar>
+              <w:top w:w="80" w:type="dxa"/>
+              <w:start w:w="120" w:type="dxa"/>
+              <w:bottom w:w="80" w:type="dxa"/>
+              <w:end w:w="120" w:type="dxa"/>
+            </w:tcMar>
+          </w:tcPr>
+          <w:p>
+            <w:r>
+              <w:rPr>
+                <w:rFonts w:ascii="Microsoft YaHei" w:hAnsi="Microsoft YaHei" w:eastAsia="Microsoft YaHei"/>
+                <w:color w:val="0B2545"/>
+                <w:sz w:val="18"/>
+              </w:rPr>
+              <w:t>https://github.com/Casys-AI/mcp-syson</w:t>
+            </w:r>
+          </w:p>
+        </w:tc>
+      </w:tr>
+      <w:tr>
+        <w:tc>
+          <w:tcPr>
+            <w:tcW w:type="dxa" w:w="1700"/>
+            <w:shd w:fill="E8EEF5"/>
+            <w:vAlign w:val="top"/>
+            <w:tcMar>
+              <w:top w:w="80" w:type="dxa"/>
+              <w:start w:w="120" w:type="dxa"/>
+              <w:bottom w:w="80" w:type="dxa"/>
+              <w:end w:w="120" w:type="dxa"/>
+            </w:tcMar>
+          </w:tcPr>
+          <w:p>
+            <w:r>
+              <w:rPr>
+                <w:rFonts w:ascii="Microsoft YaHei" w:hAnsi="Microsoft YaHei" w:eastAsia="Microsoft YaHei"/>
+                <w:b/>
+                <w:color w:val="0B2545"/>
+                <w:sz w:val="18"/>
+              </w:rPr>
+              <w:t>核验来源</w:t>
+            </w:r>
+          </w:p>
+        </w:tc>
+        <w:tc>
+          <w:tcPr>
+            <w:tcW w:type="dxa" w:w="7660"/>
+            <w:vAlign w:val="top"/>
+            <w:tcMar>
+              <w:top w:w="80" w:type="dxa"/>
+              <w:start w:w="120" w:type="dxa"/>
+              <w:bottom w:w="80" w:type="dxa"/>
+              <w:end w:w="120" w:type="dxa"/>
+            </w:tcMar>
+          </w:tcPr>
+          <w:p>
+            <w:r>
+              <w:rPr>
+                <w:rFonts w:ascii="Microsoft YaHei" w:hAnsi="Microsoft YaHei" w:eastAsia="Microsoft YaHei"/>
+                <w:color w:val="0B2545"/>
+                <w:sz w:val="18"/>
+              </w:rPr>
+              <w:t>https://github.com/Casys-AI/mcp-syson</w:t>
+            </w:r>
+          </w:p>
+        </w:tc>
+      </w:tr>
+    </w:tbl>
+    <w:p>
+      <w:pPr>
+        <w:pStyle w:val="Heading2"/>
+        <w:pageBreakBefore/>
+      </w:pPr>
+      <w:r>
+        <w:t>3.14 SysML v2 MCP Server by Raghunath Torase</w:t>
       </w:r>
     </w:p>
     <w:p>
@@ -5711,7 +6084,7 @@
         <w:pageBreakBefore/>
       </w:pPr>
       <w:r>
-        <w:t>3.14 sysml-ai-hub</w:t>
+        <w:t>3.15 sysml-ai-hub</w:t>
       </w:r>
     </w:p>
     <w:p>
@@ -6084,7 +6457,7 @@
         <w:pageBreakBefore/>
       </w:pPr>
       <w:r>
-        <w:t>3.15 sysml-v2-modeling-skill</w:t>
+        <w:t>3.16 sysml-v2-modeling-skill</w:t>
       </w:r>
     </w:p>
     <w:p>
@@ -6514,7 +6887,7 @@
           <w:color w:val="5D6B7A"/>
           <w:sz w:val="18"/>
         </w:rPr>
-        <w:t>生成时间：2026-07-31 22:19（Asia/Shanghai）</w:t>
+        <w:t>生成时间：2026-08-01 05:36（Asia/Shanghai）</w:t>
       </w:r>
     </w:p>
     <w:sectPr>

</xml_diff>